<commit_message>
Clarify band-order margin as absolute gap + relative % in TSAC section draft
'5.4% margin' was ambiguous — now reads 'slim gap of bash.29M (relative
margin of 5.4% of the Band 5 mean)' to make the magnitude clear.

Co-authored-by: factory-droid[bot] <138933559+factory-droid[bot]@users.noreply.github.com>
</commit_message>
<xml_diff>
--- a/model-tables/iusaf-tsac-section-draft.docx
+++ b/model-tables/iusaf-tsac-section-draft.docx
@@ -100,7 +100,7 @@
         <w:rPr>
           <w:rFonts w:ascii="Times New Roman" w:hAnsi="Times New Roman"/>
         </w:rPr>
-        <w:t>The IUSAF equity base is dominant for all eligible Parties without exception. Stewardship supplements never exceed the equity base for any Party. Band order is preserved with a margin of 19.3% (Band 5 mean $4.92M vs Band 6 mean $3.97M). Spearman ρ = 0.951.</w:t>
+        <w:t>The IUSAF equity base is dominant for all eligible Parties without exception. Stewardship supplements never exceed the equity base for any Party. Band order is preserved with a comfortable gap of $0.95M (Band 5 mean $4.92M vs Band 6 mean $3.97M), a relative margin of 19.3% of the Band 5 mean. Spearman ρ = 0.951.</w:t>
       </w:r>
     </w:p>
     <w:p>
@@ -118,7 +118,7 @@
         <w:rPr>
           <w:rFonts w:ascii="Times New Roman" w:hAnsi="Times New Roman"/>
         </w:rPr>
-        <w:t>The point at which the Gini coefficient is lowest while preserving IUSAF band order. If this balance point is chosen, stewardship may approach but does not exceed the equity base for developing country Parties with a large landmass. Band order is preserved with a margin of 5.4% (Band 5 mean $5.44M vs Band 6 mean $5.15M). Spearman ρ = 0.945.</w:t>
+        <w:t>The point at which the Gini coefficient is lowest while preserving IUSAF band order. If this balance point is chosen, stewardship may approach but does not exceed the equity base for developing country Parties with a large landmass. Band order is preserved with a slim absolute gap of $0.29M (Band 5 mean $5.44M vs Band 6 mean $5.15M), a relative margin of 5.4% of the Band 5 mean. Spearman ρ = 0.945.</w:t>
       </w:r>
     </w:p>
     <w:p>
@@ -929,7 +929,7 @@
         <w:spacing w:after="240"/>
       </w:pPr>
       <w:r>
-        <w:t>The key observation in Table A is that at TSAC = 2.5% (the Gini-minimum) the IUSAF band order is preserved with a margin of 5.4%, but at TSAC = 3.0% Band 6 is receiving a higher allocation than Band 5, breaking the descending monotonic requirement. This overturn occurs at a TSAC value 17× lower than the simple model overturn threshold (TSAC + SOSAC = 50%), underscoring the sensitivity of the band ordering to the TSAC stewardship overlay.</w:t>
+        <w:t>The key observation in Table A is that at TSAC = 2.5% (the Gini-minimum) the IUSAF band order is preserved with a slim gap of $0.29M (a relative margin of 5.4% of the Band 5 mean), but at TSAC = 3.0% Band 6 is receiving a higher allocation than Band 5, breaking the descending monotonic requirement. This overturn occurs at a TSAC value 17× lower than the simple model overturn threshold (TSAC + SOSAC = 50%), underscoring the sensitivity of the band ordering to the TSAC stewardship overlay.</w:t>
       </w:r>
     </w:p>
     <w:p>
@@ -4291,7 +4291,7 @@
         <w:spacing w:after="240"/>
       </w:pPr>
       <w:r>
-        <w:t>A final consideration for Parties is whether the balance points above should preserve strictly decreasing (monotonic) order in the amounts allocated by IUSAF band or whether relaxation is permitted in order to adequately recognise the stewardship responsibilities of some Parties. Under Option D, the Gini-minimum balance point (TSAC = 2.5%) preserves band order with a margin of 5.4%. If Parties wish to go beyond this towards greater terrestrial stewardship recognition, they may accept band-order relaxation, in which case settings up to TSAC = 3.5% (the former "Bounded" point) remain within the range where IUSAF is still the dominant component for most Parties. However, such settings would mean that Parties in a higher band (Band 6) could receive allocations higher than Parties in a lower band (Band 5), breaching the strictly decreasing order of allocations.</w:t>
+        <w:t>A final consideration for Parties is whether the balance points above should preserve strictly decreasing (monotonic) order in the amounts allocated by IUSAF band or whether relaxation is permitted in order to adequately recognise the stewardship responsibilities of some Parties. Under Option D, the Gini-minimum balance point (TSAC = 2.5%) preserves band order with a slim gap of $0.29M (relative margin of 5.4% of the Band 5 mean). If Parties wish to go beyond this towards greater terrestrial stewardship recognition, they may accept band-order relaxation, in which case settings up to TSAC = 3.5% (the former "Bounded" point) remain within the range where IUSAF is still the dominant component for most Parties. However, such settings would mean that Parties in a higher band (Band 6) could receive allocations higher than Parties in a lower band (Band 5), breaching the strictly decreasing order of allocations.</w:t>
       </w:r>
     </w:p>
     <w:sectPr>

</xml_diff>

<commit_message>
Replace delta symbol with 'Change' in band transfer table headers for clarity
Co-authored-by: factory-droid[bot] <138933559+factory-droid[bot]@users.noreply.github.com>
</commit_message>
<xml_diff>
--- a/model-tables/iusaf-tsac-section-draft.docx
+++ b/model-tables/iusaf-tsac-section-draft.docx
@@ -5282,7 +5282,7 @@
                 <w:b/>
                 <w:sz w:val="17"/>
               </w:rPr>
-              <w:t>Δ at 1.5%</w:t>
+              <w:t>Change at</w:t>
             </w:r>
             <w:r>
               <w:br/>
@@ -5293,7 +5293,7 @@
                 <w:b/>
                 <w:sz w:val="17"/>
               </w:rPr>
-              <w:t>(USD M)</w:t>
+              <w:t>1.5% (USD M)</w:t>
             </w:r>
           </w:p>
         </w:tc>
@@ -5313,7 +5313,7 @@
                 <w:b/>
                 <w:sz w:val="17"/>
               </w:rPr>
-              <w:t>Δ at 2.5%</w:t>
+              <w:t>Change at</w:t>
             </w:r>
             <w:r>
               <w:br/>
@@ -5324,7 +5324,7 @@
                 <w:b/>
                 <w:sz w:val="17"/>
               </w:rPr>
-              <w:t>(USD M)</w:t>
+              <w:t>2.5% (USD M)</w:t>
             </w:r>
           </w:p>
         </w:tc>
@@ -5344,7 +5344,7 @@
                 <w:b/>
                 <w:sz w:val="17"/>
               </w:rPr>
-              <w:t>Δ at 3.0%</w:t>
+              <w:t>Change at</w:t>
             </w:r>
             <w:r>
               <w:br/>
@@ -5355,7 +5355,7 @@
                 <w:b/>
                 <w:sz w:val="17"/>
               </w:rPr>
-              <w:t>(USD M)</w:t>
+              <w:t>3.0% (USD M)</w:t>
             </w:r>
           </w:p>
         </w:tc>
@@ -5375,7 +5375,7 @@
                 <w:b/>
                 <w:sz w:val="17"/>
               </w:rPr>
-              <w:t>Δ at 3.5%</w:t>
+              <w:t>Change at</w:t>
             </w:r>
             <w:r>
               <w:br/>
@@ -5386,7 +5386,7 @@
                 <w:b/>
                 <w:sz w:val="17"/>
               </w:rPr>
-              <w:t>(USD M)</w:t>
+              <w:t>3.5% (USD M)</w:t>
             </w:r>
           </w:p>
         </w:tc>
@@ -5406,7 +5406,7 @@
                 <w:b/>
                 <w:sz w:val="17"/>
               </w:rPr>
-              <w:t>Δ at 5.0%</w:t>
+              <w:t>Change at</w:t>
             </w:r>
             <w:r>
               <w:br/>
@@ -5417,7 +5417,7 @@
                 <w:b/>
                 <w:sz w:val="17"/>
               </w:rPr>
-              <w:t>(USD M)</w:t>
+              <w:t>5.0% (USD M)</w:t>
             </w:r>
           </w:p>
         </w:tc>
@@ -6215,7 +6215,7 @@
           <w:i/>
           <w:sz w:val="17"/>
         </w:rPr>
-        <w:t>Table D2. Change in total band allocation vs pure IUSAF (USD M, SOSAC = 3%)</w:t>
+        <w:t>Table D2. Change in total band allocation vs pure IUSAF (USD M, SOSAC = 3%). Positive = band gains; negative = band loses.</w:t>
       </w:r>
     </w:p>
     <w:p>

</xml_diff>